<commit_message>
Actualización del documento de entrega y creación de un nuevo script para la detección de contornos y clasificación de formas, ajustando parámetros y mejorando el flujo de procesamiento.
</commit_message>
<xml_diff>
--- a/TP1 -U5/Correa Pablo_TP1-Deteccion de contornos.docx
+++ b/TP1 -U5/Correa Pablo_TP1-Deteccion de contornos.docx
@@ -3,68 +3,76 @@
 <w:document xmlns:wpc="http://schemas.microsoft.com/office/word/2010/wordprocessingCanvas" xmlns:cx="http://schemas.microsoft.com/office/drawing/2014/chartex" xmlns:cx1="http://schemas.microsoft.com/office/drawing/2015/9/8/chartex" xmlns:cx2="http://schemas.microsoft.com/office/drawing/2015/10/21/chartex" xmlns:cx3="http://schemas.microsoft.com/office/drawing/2016/5/9/chartex" xmlns:cx4="http://schemas.microsoft.com/office/drawing/2016/5/10/chartex" xmlns:cx5="http://schemas.microsoft.com/office/drawing/2016/5/11/chartex" xmlns:cx6="http://schemas.microsoft.com/office/drawing/2016/5/12/chartex" xmlns:cx7="http://schemas.microsoft.com/office/drawing/2016/5/13/chartex" xmlns:cx8="http://schemas.microsoft.com/office/drawing/2016/5/14/chartex" xmlns:mc="http://schemas.openxmlformats.org/markup-compatibility/2006" xmlns:aink="http://schemas.microsoft.com/office/drawing/2016/ink" xmlns:am3d="http://schemas.microsoft.com/office/drawing/2017/model3d" xmlns:o="urn:schemas-microsoft-com:office:office" xmlns:oel="http://schemas.microsoft.com/office/2019/extlst" xmlns:r="http://schemas.openxmlformats.org/officeDocument/2006/relationships" xmlns:m="http://schemas.openxmlformats.org/officeDocument/2006/math" xmlns:v="urn:schemas-microsoft-com:vml" xmlns:wp14="http://schemas.microsoft.com/office/word/2010/wordprocessingDrawing" xmlns:wp="http://schemas.openxmlformats.org/drawingml/2006/wordprocessingDrawing" xmlns:w10="urn:schemas-microsoft-com:office:word" xmlns:w="http://schemas.openxmlformats.org/wordprocessingml/2006/main" xmlns:w14="http://schemas.microsoft.com/office/word/2010/wordml" xmlns:w15="http://schemas.microsoft.com/office/word/2012/wordml" xmlns:w16cex="http://schemas.microsoft.com/office/word/2018/wordml/cex" xmlns:w16cid="http://schemas.microsoft.com/office/word/2016/wordml/cid" xmlns:w16="http://schemas.microsoft.com/office/word/2018/wordml" xmlns:w16du="http://schemas.microsoft.com/office/word/2023/wordml/word16du" xmlns:w16sdtdh="http://schemas.microsoft.com/office/word/2020/wordml/sdtdatahash" xmlns:w16sdtfl="http://schemas.microsoft.com/office/word/2024/wordml/sdtformatlock" xmlns:w16se="http://schemas.microsoft.com/office/word/2015/wordml/symex" xmlns:wpg="http://schemas.microsoft.com/office/word/2010/wordprocessingGroup" xmlns:wpi="http://schemas.microsoft.com/office/word/2010/wordprocessingInk" xmlns:wne="http://schemas.microsoft.com/office/word/2006/wordml" xmlns:wps="http://schemas.microsoft.com/office/word/2010/wordprocessingShape" mc:Ignorable="w14 w15 w16se w16cid w16 w16cex w16sdtdh w16sdtfl w16du wp14">
   <w:body>
     <w:p>
+      <w:pPr>
+        <w:pStyle w:val="Parrafonormal"/>
+      </w:pPr>
       <w:r>
         <w:t>TRABAJO PRÁCTICO N°1: DETECCIÓN DE CONTORNOS, BOUNDING BOX Y CLASIFICACIÓN DE FORMAS</w:t>
       </w:r>
     </w:p>
     <w:p>
+      <w:pPr>
+        <w:pStyle w:val="Parrafonormal"/>
+      </w:pPr>
       <w:r>
         <w:t>Alumno:</w:t>
       </w:r>
     </w:p>
     <w:p>
+      <w:pPr>
+        <w:pStyle w:val="Parrafonormal"/>
+      </w:pPr>
       <w:r>
         <w:t xml:space="preserve">Fecha de entrega: </w:t>
       </w:r>
-      <w:proofErr w:type="gramStart"/>
-      <w:r>
-        <w:t>Martes</w:t>
-      </w:r>
-      <w:proofErr w:type="gramEnd"/>
+      <w:r>
+        <w:t>martes</w:t>
+      </w:r>
       <w:r>
         <w:t xml:space="preserve"> 5 de </w:t>
       </w:r>
-      <w:proofErr w:type="gramStart"/>
-      <w:r>
-        <w:t>Mayo</w:t>
-      </w:r>
-      <w:proofErr w:type="gramEnd"/>
-    </w:p>
-    <w:p>
+      <w:r>
+        <w:t>mayo</w:t>
+      </w:r>
+    </w:p>
+    <w:p>
+      <w:pPr>
+        <w:pStyle w:val="Parrafonormal"/>
+      </w:pPr>
       <w:r>
         <w:t>Objetivo general</w:t>
       </w:r>
     </w:p>
-    <w:p/>
-    <w:p>
+    <w:p>
+      <w:pPr>
+        <w:pStyle w:val="Parrafonormal"/>
+      </w:pPr>
       <w:r>
         <w:t>Aplicar las herramientas vistas en clase para detectar objetos en una imagen, extraer características geométricas simples y clasificarlas según su forma.</w:t>
       </w:r>
     </w:p>
     <w:p>
+      <w:pPr>
+        <w:pStyle w:val="Ttulo2"/>
+      </w:pPr>
       <w:r>
         <w:t>Parte 1: Clasificación de cuadrados y rectángulos</w:t>
       </w:r>
     </w:p>
     <w:p>
-      <w:r>
-        <w:t xml:space="preserve">A partir de la imagen provista desarrollar un programa en </w:t>
-      </w:r>
-      <w:proofErr w:type="spellStart"/>
-      <w:r>
-        <w:t>OpenCV</w:t>
-      </w:r>
-      <w:proofErr w:type="spellEnd"/>
-      <w:r>
-        <w:t xml:space="preserve"> que permita:</w:t>
-      </w:r>
-    </w:p>
-    <w:p>
-      <w:pPr>
-        <w:pStyle w:val="Prrafodelista"/>
+      <w:pPr>
+        <w:pStyle w:val="Parrafonormal"/>
+      </w:pPr>
+      <w:r>
+        <w:t>A partir de la imagen provista desarrollar un programa en OpenCV que permita:</w:t>
+      </w:r>
+    </w:p>
+    <w:p>
+      <w:pPr>
+        <w:pStyle w:val="Parrafonormal"/>
         <w:numPr>
           <w:ilvl w:val="0"/>
-          <w:numId w:val="1"/>
+          <w:numId w:val="4"/>
         </w:numPr>
       </w:pPr>
       <w:r>
@@ -73,10 +81,10 @@
     </w:p>
     <w:p>
       <w:pPr>
-        <w:pStyle w:val="Prrafodelista"/>
+        <w:pStyle w:val="Parrafonormal"/>
         <w:numPr>
           <w:ilvl w:val="0"/>
-          <w:numId w:val="1"/>
+          <w:numId w:val="4"/>
         </w:numPr>
       </w:pPr>
       <w:r>
@@ -85,153 +93,820 @@
     </w:p>
     <w:p>
       <w:pPr>
-        <w:pStyle w:val="Prrafodelista"/>
+        <w:pStyle w:val="Parrafonormal"/>
         <w:numPr>
           <w:ilvl w:val="0"/>
-          <w:numId w:val="1"/>
+          <w:numId w:val="4"/>
         </w:numPr>
       </w:pPr>
       <w:r>
-        <w:t xml:space="preserve">Clasificar los objetos rectangulares en cuadrados o rectángulos usando </w:t>
-      </w:r>
-      <w:proofErr w:type="spellStart"/>
-      <w:r>
-        <w:t>bounding</w:t>
-      </w:r>
-      <w:proofErr w:type="spellEnd"/>
-      <w:r>
-        <w:t xml:space="preserve"> box y la </w:t>
-      </w:r>
-      <w:proofErr w:type="gramStart"/>
-      <w:r>
-        <w:t>relación ancho</w:t>
-      </w:r>
-      <w:proofErr w:type="gramEnd"/>
-      <w:r>
-        <w:t>/alto.</w:t>
-      </w:r>
-    </w:p>
-    <w:p>
-      <w:pPr>
-        <w:pStyle w:val="Prrafodelista"/>
+        <w:t>Clasificar los objetos rectangulares en cuadrados o rectángulos usando bounding box y la relación ancho/alto.</w:t>
+      </w:r>
+    </w:p>
+    <w:p>
+      <w:pPr>
+        <w:pStyle w:val="Parrafonormal"/>
         <w:numPr>
           <w:ilvl w:val="0"/>
-          <w:numId w:val="1"/>
+          <w:numId w:val="4"/>
         </w:numPr>
       </w:pPr>
       <w:r>
-        <w:t xml:space="preserve">Dibujar sobre la imagen las </w:t>
-      </w:r>
-      <w:proofErr w:type="spellStart"/>
+        <w:t>Dibujar sobre la imagen las bounding box y el nombre de la figura detectada.</w:t>
+      </w:r>
+    </w:p>
+    <w:p>
+      <w:pPr>
+        <w:pStyle w:val="Parrafonormal"/>
+        <w:numPr>
+          <w:ilvl w:val="0"/>
+          <w:numId w:val="4"/>
+        </w:numPr>
+      </w:pPr>
+      <w:r>
+        <w:t>Deberán incluir explícitamente el pipeline de procesamiento utilizado para resolver el problema.</w:t>
+      </w:r>
+    </w:p>
+    <w:p>
+      <w:pPr>
+        <w:pStyle w:val="Parrafonormal"/>
+      </w:pPr>
+      <w:r>
+        <w:t>Se debe mostrar:</w:t>
+      </w:r>
+    </w:p>
+    <w:p>
+      <w:pPr>
+        <w:pStyle w:val="Parrafonormal"/>
+        <w:numPr>
+          <w:ilvl w:val="0"/>
+          <w:numId w:val="7"/>
+        </w:numPr>
+      </w:pPr>
+      <w:r>
+        <w:t>La imagen original</w:t>
+      </w:r>
+    </w:p>
+    <w:p>
+      <w:pPr>
+        <w:pStyle w:val="Ttulo3"/>
+      </w:pPr>
+      <w:r>
+        <w:lastRenderedPageBreak/>
+        <w:t>2.La imagen en escala de grises</w:t>
+      </w:r>
+    </w:p>
+    <w:p>
+      <w:pPr>
+        <w:pStyle w:val="Prrafodelista"/>
+      </w:pPr>
+      <w:r>
+        <w:drawing>
+          <wp:inline distT="0" distB="0" distL="0" distR="0" wp14:anchorId="5499B241" wp14:editId="27584833">
+            <wp:extent cx="4048690" cy="5992061"/>
+            <wp:effectExtent l="0" t="0" r="9525" b="8890"/>
+            <wp:docPr id="1887208301" name="Imagen 1"/>
+            <wp:cNvGraphicFramePr>
+              <a:graphicFrameLocks xmlns:a="http://schemas.openxmlformats.org/drawingml/2006/main" noChangeAspect="1"/>
+            </wp:cNvGraphicFramePr>
+            <a:graphic xmlns:a="http://schemas.openxmlformats.org/drawingml/2006/main">
+              <a:graphicData uri="http://schemas.openxmlformats.org/drawingml/2006/picture">
+                <pic:pic xmlns:pic="http://schemas.openxmlformats.org/drawingml/2006/picture">
+                  <pic:nvPicPr>
+                    <pic:cNvPr id="1887208301" name=""/>
+                    <pic:cNvPicPr/>
+                  </pic:nvPicPr>
+                  <pic:blipFill>
+                    <a:blip r:embed="rId7"/>
+                    <a:stretch>
+                      <a:fillRect/>
+                    </a:stretch>
+                  </pic:blipFill>
+                  <pic:spPr>
+                    <a:xfrm>
+                      <a:off x="0" y="0"/>
+                      <a:ext cx="4048690" cy="5992061"/>
+                    </a:xfrm>
+                    <a:prstGeom prst="rect">
+                      <a:avLst/>
+                    </a:prstGeom>
+                  </pic:spPr>
+                </pic:pic>
+              </a:graphicData>
+            </a:graphic>
+          </wp:inline>
+        </w:drawing>
+      </w:r>
+    </w:p>
+    <w:p>
+      <w:pPr>
+        <w:pStyle w:val="Ttulo3"/>
+      </w:pPr>
+      <w:r>
+        <w:lastRenderedPageBreak/>
+        <w:t>3.La imagen binarizada</w:t>
+      </w:r>
+    </w:p>
+    <w:p>
+      <w:pPr>
+        <w:pStyle w:val="Prrafodelista"/>
+      </w:pPr>
+      <w:r>
+        <w:drawing>
+          <wp:inline distT="0" distB="0" distL="0" distR="0" wp14:anchorId="5BD14DB0" wp14:editId="079E4A02">
+            <wp:extent cx="4077269" cy="6011114"/>
+            <wp:effectExtent l="0" t="0" r="0" b="8890"/>
+            <wp:docPr id="895674556" name="Imagen 1"/>
+            <wp:cNvGraphicFramePr>
+              <a:graphicFrameLocks xmlns:a="http://schemas.openxmlformats.org/drawingml/2006/main" noChangeAspect="1"/>
+            </wp:cNvGraphicFramePr>
+            <a:graphic xmlns:a="http://schemas.openxmlformats.org/drawingml/2006/main">
+              <a:graphicData uri="http://schemas.openxmlformats.org/drawingml/2006/picture">
+                <pic:pic xmlns:pic="http://schemas.openxmlformats.org/drawingml/2006/picture">
+                  <pic:nvPicPr>
+                    <pic:cNvPr id="895674556" name=""/>
+                    <pic:cNvPicPr/>
+                  </pic:nvPicPr>
+                  <pic:blipFill>
+                    <a:blip r:embed="rId8"/>
+                    <a:stretch>
+                      <a:fillRect/>
+                    </a:stretch>
+                  </pic:blipFill>
+                  <pic:spPr>
+                    <a:xfrm>
+                      <a:off x="0" y="0"/>
+                      <a:ext cx="4077269" cy="6011114"/>
+                    </a:xfrm>
+                    <a:prstGeom prst="rect">
+                      <a:avLst/>
+                    </a:prstGeom>
+                  </pic:spPr>
+                </pic:pic>
+              </a:graphicData>
+            </a:graphic>
+          </wp:inline>
+        </w:drawing>
+      </w:r>
+    </w:p>
+    <w:p>
+      <w:pPr>
+        <w:pStyle w:val="Ttulo4"/>
+      </w:pPr>
+      <w:r>
+        <w:lastRenderedPageBreak/>
+        <w:t>4.La imagen final con clasificación, bounding box y nombre de la figura.</w:t>
+      </w:r>
+    </w:p>
+    <w:p>
+      <w:pPr>
+        <w:pStyle w:val="Prrafodelista"/>
+      </w:pPr>
+      <w:r>
+        <w:drawing>
+          <wp:inline distT="0" distB="0" distL="0" distR="0" wp14:anchorId="023A2AC9" wp14:editId="0C881672">
+            <wp:extent cx="4067743" cy="6001588"/>
+            <wp:effectExtent l="0" t="0" r="9525" b="0"/>
+            <wp:docPr id="419437936" name="Imagen 1"/>
+            <wp:cNvGraphicFramePr>
+              <a:graphicFrameLocks xmlns:a="http://schemas.openxmlformats.org/drawingml/2006/main" noChangeAspect="1"/>
+            </wp:cNvGraphicFramePr>
+            <a:graphic xmlns:a="http://schemas.openxmlformats.org/drawingml/2006/main">
+              <a:graphicData uri="http://schemas.openxmlformats.org/drawingml/2006/picture">
+                <pic:pic xmlns:pic="http://schemas.openxmlformats.org/drawingml/2006/picture">
+                  <pic:nvPicPr>
+                    <pic:cNvPr id="419437936" name=""/>
+                    <pic:cNvPicPr/>
+                  </pic:nvPicPr>
+                  <pic:blipFill>
+                    <a:blip r:embed="rId9"/>
+                    <a:stretch>
+                      <a:fillRect/>
+                    </a:stretch>
+                  </pic:blipFill>
+                  <pic:spPr>
+                    <a:xfrm>
+                      <a:off x="0" y="0"/>
+                      <a:ext cx="4067743" cy="6001588"/>
+                    </a:xfrm>
+                    <a:prstGeom prst="rect">
+                      <a:avLst/>
+                    </a:prstGeom>
+                  </pic:spPr>
+                </pic:pic>
+              </a:graphicData>
+            </a:graphic>
+          </wp:inline>
+        </w:drawing>
+      </w:r>
+    </w:p>
+    <w:p>
+      <w:pPr>
+        <w:pStyle w:val="Prrafodelista"/>
+      </w:pPr>
+    </w:p>
+    <w:p>
+      <w:pPr>
+        <w:pStyle w:val="Ttulo2"/>
+      </w:pPr>
+      <w:r>
+        <w:t>Parte 2: Detección de círculos</w:t>
+      </w:r>
+    </w:p>
+    <w:p>
+      <w:pPr>
+        <w:pStyle w:val="Parrafonormal"/>
+      </w:pPr>
+      <w:r>
+        <w:t>En esta segunda parte, deberán detectar los objetos con forma aproximadamente circular presentes en la imagen.</w:t>
+      </w:r>
+    </w:p>
+    <w:p>
+      <w:pPr>
+        <w:pStyle w:val="Parrafonormal"/>
+      </w:pPr>
+      <w:r>
+        <w:t>Se debe mostrar la imagen final con la clasificación de círculos, su bounding box y el nombre de la figura.</w:t>
+      </w:r>
+    </w:p>
+    <w:p>
+      <w:pPr>
+        <w:pStyle w:val="Parrafonormal"/>
+      </w:pPr>
+      <w:r>
+        <w:lastRenderedPageBreak/>
+        <w:t>Ayuda: para distinguir círculos de otras formas pueden aplicar el concepto de circularidad.</w:t>
+      </w:r>
+    </w:p>
+    <w:p>
+      <w:pPr>
+        <w:pStyle w:val="Parrafonormal"/>
+        <w:rPr>
+          <w:rFonts w:asciiTheme="minorHAnsi" w:eastAsiaTheme="minorEastAsia" w:hAnsiTheme="minorHAnsi"/>
+        </w:rPr>
+      </w:pPr>
+      <m:oMathPara>
+        <m:oMath>
+          <m:r>
+            <w:rPr>
+              <w:rFonts w:ascii="Cambria Math" w:hAnsi="Cambria Math"/>
+            </w:rPr>
+            <m:t>circularidad=</m:t>
+          </m:r>
+          <m:f>
+            <m:fPr>
+              <m:ctrlPr>
+                <w:rPr>
+                  <w:rFonts w:ascii="Cambria Math" w:eastAsiaTheme="minorEastAsia" w:hAnsi="Cambria Math"/>
+                  <w:i/>
+                </w:rPr>
+              </m:ctrlPr>
+            </m:fPr>
+            <m:num>
+              <m:r>
+                <w:rPr>
+                  <w:rFonts w:ascii="Cambria Math" w:hAnsi="Cambria Math"/>
+                </w:rPr>
+                <m:t>4 . π</m:t>
+              </m:r>
+              <m:r>
+                <w:rPr>
+                  <w:rFonts w:ascii="Cambria Math" w:eastAsiaTheme="minorEastAsia" w:hAnsi="Cambria Math"/>
+                </w:rPr>
+                <m:t xml:space="preserve"> . área</m:t>
+              </m:r>
+            </m:num>
+            <m:den>
+              <m:r>
+                <w:rPr>
+                  <w:rFonts w:ascii="Cambria Math" w:eastAsiaTheme="minorEastAsia" w:hAnsi="Cambria Math"/>
+                </w:rPr>
+                <m:t>perímetr</m:t>
+              </m:r>
+              <m:sSup>
+                <m:sSupPr>
+                  <m:ctrlPr>
+                    <w:rPr>
+                      <w:rFonts w:ascii="Cambria Math" w:eastAsiaTheme="minorEastAsia" w:hAnsi="Cambria Math"/>
+                      <w:i/>
+                    </w:rPr>
+                  </m:ctrlPr>
+                </m:sSupPr>
+                <m:e>
+                  <m:r>
+                    <w:rPr>
+                      <w:rFonts w:ascii="Cambria Math" w:eastAsiaTheme="minorEastAsia" w:hAnsi="Cambria Math"/>
+                    </w:rPr>
+                    <m:t>o</m:t>
+                  </m:r>
+                </m:e>
+                <m:sup>
+                  <m:r>
+                    <w:rPr>
+                      <w:rFonts w:ascii="Cambria Math" w:eastAsiaTheme="minorEastAsia" w:hAnsi="Cambria Math"/>
+                    </w:rPr>
+                    <m:t>2</m:t>
+                  </m:r>
+                </m:sup>
+              </m:sSup>
+            </m:den>
+          </m:f>
+        </m:oMath>
+      </m:oMathPara>
+    </w:p>
+    <w:p>
+      <w:pPr>
+        <w:pStyle w:val="Parrafonormal"/>
+      </w:pPr>
+      <w:r>
+        <w:t>Para un círculo ideal la circularidad tiende a un valor cercano a 1.</w:t>
+      </w:r>
+    </w:p>
+    <w:p>
+      <w:pPr>
+        <w:pStyle w:val="Parrafonormal"/>
+      </w:pPr>
+      <w:r>
+        <w:t>Por lo tanto, podemos considerar que un objeto es aproximadamente circular</w:t>
+      </w:r>
+      <w:r>
+        <w:t xml:space="preserve"> cuando:</w:t>
+      </w:r>
+    </w:p>
+    <w:p>
+      <w:pPr>
+        <w:pStyle w:val="Parrafonormal"/>
+        <w:numPr>
+          <w:ilvl w:val="0"/>
+          <w:numId w:val="5"/>
+        </w:numPr>
+      </w:pPr>
+      <w:r>
+        <w:t xml:space="preserve">Su </w:t>
+      </w:r>
       <w:r>
         <w:t>bounding</w:t>
       </w:r>
-      <w:proofErr w:type="spellEnd"/>
-      <w:r>
-        <w:t xml:space="preserve"> box y el nombre de la figura </w:t>
-      </w:r>
-      <w:proofErr w:type="spellStart"/>
-      <w:proofErr w:type="gramStart"/>
-      <w:r>
-        <w:t>detectada.Deberán</w:t>
-      </w:r>
-      <w:proofErr w:type="spellEnd"/>
-      <w:proofErr w:type="gramEnd"/>
-      <w:r>
-        <w:t xml:space="preserve"> incluir explícitamente el pipeline de procesamiento utilizado para resolver el problema.</w:t>
-      </w:r>
-    </w:p>
-    <w:p>
-      <w:pPr>
-        <w:pStyle w:val="Prrafodelista"/>
-      </w:pPr>
-      <w:r>
-        <w:t>Se debe mostrar:</w:t>
-      </w:r>
-    </w:p>
-    <w:p>
-      <w:pPr>
-        <w:pStyle w:val="Prrafodelista"/>
-      </w:pPr>
-      <w:r>
-        <w:t>1.La imagen original</w:t>
-      </w:r>
-    </w:p>
-    <w:p>
-      <w:pPr>
-        <w:pStyle w:val="Prrafodelista"/>
-      </w:pPr>
-      <w:r>
-        <w:t>2.La imagen en escala de grises</w:t>
-      </w:r>
-    </w:p>
-    <w:p>
-      <w:pPr>
-        <w:pStyle w:val="Prrafodelista"/>
-      </w:pPr>
-      <w:r>
-        <w:t xml:space="preserve">3.La imagen </w:t>
-      </w:r>
-      <w:proofErr w:type="spellStart"/>
-      <w:r>
-        <w:t>binarizada</w:t>
-      </w:r>
-      <w:proofErr w:type="spellEnd"/>
-    </w:p>
-    <w:p>
-      <w:pPr>
-        <w:pStyle w:val="Prrafodelista"/>
-      </w:pPr>
-      <w:r>
-        <w:t xml:space="preserve">4.La imagen final con clasificación, </w:t>
-      </w:r>
-      <w:proofErr w:type="spellStart"/>
-      <w:r>
-        <w:t>bounding</w:t>
-      </w:r>
-      <w:proofErr w:type="spellEnd"/>
-      <w:r>
-        <w:t xml:space="preserve"> box y nombre de la figura.</w:t>
-      </w:r>
-    </w:p>
-    <w:p>
-      <w:pPr>
-        <w:pStyle w:val="Prrafodelista"/>
-      </w:pPr>
-      <w:r>
-        <w:t>Parte 2: Detección de círculos</w:t>
-      </w:r>
-    </w:p>
-    <w:p>
-      <w:pPr>
-        <w:pStyle w:val="Prrafodelista"/>
-      </w:pPr>
-      <w:r>
-        <w:t>En esta segunda parte, deberán detectar los objetos con forma aproximadamente circular presentes en la imagen.</w:t>
-      </w:r>
-    </w:p>
-    <w:p>
-      <w:pPr>
-        <w:pStyle w:val="Prrafodelista"/>
-      </w:pPr>
-      <w:r>
-        <w:t xml:space="preserve">Se debe mostrar la imagen final con la clasificación de círculos, su </w:t>
-      </w:r>
-      <w:proofErr w:type="spellStart"/>
-      <w:r>
-        <w:t>bounding</w:t>
-      </w:r>
-      <w:proofErr w:type="spellEnd"/>
-      <w:r>
-        <w:t xml:space="preserve"> box y el nombre de la figura.</w:t>
-      </w:r>
-    </w:p>
-    <w:p>
-      <w:pPr>
-        <w:pStyle w:val="Prrafodelista"/>
-      </w:pPr>
-      <w:r>
-        <w:t>Ayuda: para distinguir círculos de otras formas pueden aplicar el concepto de circularidad.</w:t>
+      <w:r>
+        <w:t xml:space="preserve"> box tenga un ancho y alto parecidos</w:t>
+      </w:r>
+    </w:p>
+    <w:p>
+      <w:pPr>
+        <w:pStyle w:val="Parrafonormal"/>
+        <w:numPr>
+          <w:ilvl w:val="0"/>
+          <w:numId w:val="5"/>
+        </w:numPr>
+      </w:pPr>
+      <w:r>
+        <w:t>Su circularidad sea suficientemente alta.</w:t>
+      </w:r>
+    </w:p>
+    <w:p>
+      <w:pPr>
+        <w:pStyle w:val="Parrafonormal"/>
+      </w:pPr>
+      <w:r>
+        <w:t>Responder:</w:t>
+      </w:r>
+    </w:p>
+    <w:p>
+      <w:pPr>
+        <w:pStyle w:val="Parrafonormal"/>
+        <w:numPr>
+          <w:ilvl w:val="0"/>
+          <w:numId w:val="3"/>
+        </w:numPr>
+      </w:pPr>
+      <w:r>
+        <w:t>¿Por qué es necesario filtrar contornos pequeños por área?</w:t>
+      </w:r>
+    </w:p>
+    <w:p>
+      <w:pPr>
+        <w:pStyle w:val="Parrafonormal"/>
+        <w:numPr>
+          <w:ilvl w:val="0"/>
+          <w:numId w:val="3"/>
+        </w:numPr>
+      </w:pPr>
+      <w:r>
+        <w:t>¿Por qué no alcanza solamente con la bouding box para distinguir un círculo de un cuadrado?</w:t>
+      </w:r>
+    </w:p>
+    <w:p>
+      <w:pPr>
+        <w:pStyle w:val="Parrafonormal"/>
+        <w:numPr>
+          <w:ilvl w:val="0"/>
+          <w:numId w:val="3"/>
+        </w:numPr>
+      </w:pPr>
+      <w:r>
+        <w:t xml:space="preserve">¿Qué </w:t>
+      </w:r>
+      <w:r>
+        <w:t>dificultades tiene esta imagen en comparación con la imagen de</w:t>
+      </w:r>
+      <w:r>
+        <w:t xml:space="preserve"> figuras geométricas trabajada en clase?</w:t>
+      </w:r>
+    </w:p>
+    <w:p>
+      <w:pPr>
+        <w:pStyle w:val="Parrafonormal"/>
+        <w:numPr>
+          <w:ilvl w:val="0"/>
+          <w:numId w:val="3"/>
+        </w:numPr>
+      </w:pPr>
+      <w:r>
+        <w:t>¿Qué se podría mejorar si en la imagen hubiera mucho ruido o iluminación no uniforme?</w:t>
+      </w:r>
+    </w:p>
+    <w:p>
+      <w:pPr>
+        <w:pStyle w:val="Parrafonormal"/>
+      </w:pPr>
+      <w:r>
+        <w:t>La entrega debe incluir:</w:t>
+      </w:r>
+    </w:p>
+    <w:p>
+      <w:pPr>
+        <w:pStyle w:val="Parrafonormal"/>
+        <w:numPr>
+          <w:ilvl w:val="0"/>
+          <w:numId w:val="2"/>
+        </w:numPr>
+      </w:pPr>
+      <w:r>
+        <w:t>Las imágenes de salida de cada etapa del pipeline</w:t>
+      </w:r>
+    </w:p>
+    <w:p>
+      <w:pPr>
+        <w:pStyle w:val="Parrafonormal"/>
+        <w:numPr>
+          <w:ilvl w:val="0"/>
+          <w:numId w:val="2"/>
+        </w:numPr>
+      </w:pPr>
+      <w:r>
+        <w:t>Una breve explicación del criterio utilizado para:</w:t>
+      </w:r>
+    </w:p>
+    <w:p>
+      <w:pPr>
+        <w:pStyle w:val="Parrafonormal"/>
+        <w:numPr>
+          <w:ilvl w:val="1"/>
+          <w:numId w:val="2"/>
+        </w:numPr>
+      </w:pPr>
+      <w:r>
+        <w:t xml:space="preserve">Filtrar contornos </w:t>
+      </w:r>
+      <w:r>
+        <w:t>pequeños</w:t>
+      </w:r>
+    </w:p>
+    <w:p>
+      <w:pPr>
+        <w:pStyle w:val="Parrafonormal"/>
+        <w:numPr>
+          <w:ilvl w:val="1"/>
+          <w:numId w:val="2"/>
+        </w:numPr>
+      </w:pPr>
+      <w:r>
+        <w:t xml:space="preserve">Distinguir cuadrados de </w:t>
+      </w:r>
+      <w:r>
+        <w:t>rectángulo</w:t>
+      </w:r>
+    </w:p>
+    <w:p>
+      <w:pPr>
+        <w:pStyle w:val="Parrafonormal"/>
+        <w:numPr>
+          <w:ilvl w:val="1"/>
+          <w:numId w:val="2"/>
+        </w:numPr>
+      </w:pPr>
+      <w:r>
+        <w:t>Distinguir círculos de otras formas.</w:t>
+      </w:r>
+    </w:p>
+    <w:p>
+      <w:pPr>
+        <w:pStyle w:val="Parrafonormal"/>
+        <w:numPr>
+          <w:ilvl w:val="0"/>
+          <w:numId w:val="2"/>
+        </w:numPr>
+      </w:pPr>
+      <w:r>
+        <w:t>Respuesta a las preguntas finales.</w:t>
+      </w:r>
+    </w:p>
+    <w:p>
+      <w:pPr>
+        <w:pStyle w:val="Parrafonormal"/>
+        <w:ind w:left="1069" w:firstLine="0"/>
+      </w:pPr>
+    </w:p>
+    <w:p>
+      <w:pPr>
+        <w:pStyle w:val="Ttulo4"/>
+      </w:pPr>
+      <w:r>
+        <w:rPr>
+          <w:rFonts w:eastAsiaTheme="minorEastAsia"/>
+        </w:rPr>
+        <w:t>Las imágenes de salida de cada etapa del pipeline</w:t>
+      </w:r>
+    </w:p>
+    <w:p>
+      <w:pPr>
+        <w:pStyle w:val="Parrafonormal"/>
+      </w:pPr>
+      <w:r>
+        <w:t xml:space="preserve">1. </w:t>
+      </w:r>
+      <w:r>
+        <w:t>Adquisición de imagen</w:t>
+      </w:r>
+    </w:p>
+    <w:p>
+      <w:pPr>
+        <w:pStyle w:val="Parrafonormal"/>
+      </w:pPr>
+      <w:r>
+        <w:lastRenderedPageBreak/>
+        <w:drawing>
+          <wp:inline distT="0" distB="0" distL="0" distR="0" wp14:anchorId="2F084DB1" wp14:editId="6C99498D">
+            <wp:extent cx="4077269" cy="6011114"/>
+            <wp:effectExtent l="0" t="0" r="0" b="8890"/>
+            <wp:docPr id="1221766424" name="Imagen 1"/>
+            <wp:cNvGraphicFramePr>
+              <a:graphicFrameLocks xmlns:a="http://schemas.openxmlformats.org/drawingml/2006/main" noChangeAspect="1"/>
+            </wp:cNvGraphicFramePr>
+            <a:graphic xmlns:a="http://schemas.openxmlformats.org/drawingml/2006/main">
+              <a:graphicData uri="http://schemas.openxmlformats.org/drawingml/2006/picture">
+                <pic:pic xmlns:pic="http://schemas.openxmlformats.org/drawingml/2006/picture">
+                  <pic:nvPicPr>
+                    <pic:cNvPr id="49459721" name=""/>
+                    <pic:cNvPicPr/>
+                  </pic:nvPicPr>
+                  <pic:blipFill>
+                    <a:blip r:embed="rId10"/>
+                    <a:stretch>
+                      <a:fillRect/>
+                    </a:stretch>
+                  </pic:blipFill>
+                  <pic:spPr>
+                    <a:xfrm>
+                      <a:off x="0" y="0"/>
+                      <a:ext cx="4077269" cy="6011114"/>
+                    </a:xfrm>
+                    <a:prstGeom prst="rect">
+                      <a:avLst/>
+                    </a:prstGeom>
+                  </pic:spPr>
+                </pic:pic>
+              </a:graphicData>
+            </a:graphic>
+          </wp:inline>
+        </w:drawing>
+      </w:r>
+    </w:p>
+    <w:p>
+      <w:pPr>
+        <w:pStyle w:val="Parrafonormal"/>
+      </w:pPr>
+      <w:r>
+        <w:t>2. Preprocesamiento de la imagen</w:t>
+      </w:r>
+    </w:p>
+    <w:p>
+      <w:pPr>
+        <w:pStyle w:val="Parrafonormal"/>
+      </w:pPr>
+      <w:r>
+        <w:t>• conversión de espacios de color</w:t>
+      </w:r>
+    </w:p>
+    <w:p>
+      <w:pPr>
+        <w:pStyle w:val="Parrafonormal"/>
+      </w:pPr>
+      <w:r>
+        <w:t>• normalización de la imagen</w:t>
+      </w:r>
+    </w:p>
+    <w:p>
+      <w:pPr>
+        <w:pStyle w:val="Parrafonormal"/>
+      </w:pPr>
+      <w:r>
+        <w:t>• realce de bordes</w:t>
+      </w:r>
+    </w:p>
+    <w:p>
+      <w:pPr>
+        <w:pStyle w:val="Parrafonormal"/>
+      </w:pPr>
+      <w:r>
+        <w:t>El objetivo de esta etapa es mejorar la calidad de la información visual antes de realizar el análisis de la imagen.</w:t>
+      </w:r>
+    </w:p>
+    <w:p>
+      <w:pPr>
+        <w:pStyle w:val="Parrafonormal"/>
+      </w:pPr>
+      <w:r>
+        <w:t>3. Segmentación</w:t>
+      </w:r>
+    </w:p>
+    <w:p>
+      <w:pPr>
+        <w:pStyle w:val="Parrafonormal"/>
+      </w:pPr>
+      <w:r>
+        <w:t>• detección de bordes</w:t>
+      </w:r>
+    </w:p>
+    <w:p>
+      <w:pPr>
+        <w:pStyle w:val="Parrafonormal"/>
+      </w:pPr>
+      <w:r>
+        <w:lastRenderedPageBreak/>
+        <w:t>4. Extracción de características</w:t>
+      </w:r>
+    </w:p>
+    <w:p>
+      <w:pPr>
+        <w:pStyle w:val="Parrafonormal"/>
+      </w:pPr>
+      <w:r>
+        <w:t>• forma</w:t>
+      </w:r>
+    </w:p>
+    <w:p>
+      <w:pPr>
+        <w:pStyle w:val="Parrafonormal"/>
+      </w:pPr>
+      <w:r>
+        <w:t>• tamaño</w:t>
+      </w:r>
+    </w:p>
+    <w:p>
+      <w:pPr>
+        <w:pStyle w:val="Parrafonormal"/>
+      </w:pPr>
+      <w:r>
+        <w:t>• bordes</w:t>
+      </w:r>
+    </w:p>
+    <w:p>
+      <w:pPr>
+        <w:pStyle w:val="Parrafonormal"/>
+      </w:pPr>
+      <w:r>
+        <w:t>• relaciones geométricas</w:t>
+      </w:r>
+    </w:p>
+    <w:p>
+      <w:pPr>
+        <w:pStyle w:val="Parrafonormal"/>
+      </w:pPr>
+      <w:r>
+        <w:t>5. Clasificación o interpretación</w:t>
+      </w:r>
+    </w:p>
+    <w:p>
+      <w:pPr>
+        <w:pStyle w:val="Parrafonormal"/>
+      </w:pPr>
+      <w:r>
+        <w:t>• medir dimensiones</w:t>
+      </w:r>
+    </w:p>
+    <w:p>
+      <w:pPr>
+        <w:pStyle w:val="Ttulo4"/>
+      </w:pPr>
+      <w:r>
+        <w:rPr>
+          <w:rFonts w:eastAsiaTheme="minorEastAsia"/>
+        </w:rPr>
+        <w:t>Una breve explicación del criterio utilizado para:</w:t>
+      </w:r>
+    </w:p>
+    <w:p>
+      <w:pPr>
+        <w:pStyle w:val="Ttulo5"/>
+      </w:pPr>
+      <w:r>
+        <w:rPr>
+          <w:rFonts w:eastAsiaTheme="minorEastAsia"/>
+        </w:rPr>
+        <w:t xml:space="preserve">Filtrar contornos </w:t>
+      </w:r>
+      <w:r>
+        <w:t>pequeños</w:t>
+      </w:r>
+    </w:p>
+    <w:p>
+      <w:pPr>
+        <w:pStyle w:val="Ttulo5"/>
+      </w:pPr>
+      <w:r>
+        <w:rPr>
+          <w:rFonts w:eastAsiaTheme="minorEastAsia"/>
+        </w:rPr>
+        <w:t xml:space="preserve">Distinguir cuadrados de </w:t>
+      </w:r>
+      <w:r>
+        <w:t>rectángulo</w:t>
+      </w:r>
+    </w:p>
+    <w:p>
+      <w:pPr>
+        <w:pStyle w:val="Ttulo5"/>
+      </w:pPr>
+      <w:r>
+        <w:rPr>
+          <w:rFonts w:eastAsiaTheme="minorEastAsia"/>
+        </w:rPr>
+        <w:t>Distinguir círculos de otras formas.</w:t>
+      </w:r>
+    </w:p>
+    <w:p>
+      <w:pPr>
+        <w:pStyle w:val="Ttulo4"/>
+      </w:pPr>
+      <w:r>
+        <w:rPr>
+          <w:rFonts w:eastAsiaTheme="minorEastAsia"/>
+        </w:rPr>
+        <w:t>Respuesta a las preguntas finales.</w:t>
+      </w:r>
+    </w:p>
+    <w:p>
+      <w:pPr>
+        <w:pStyle w:val="Ttulo6"/>
+      </w:pPr>
+      <w:r>
+        <w:rPr>
+          <w:rFonts w:eastAsiaTheme="minorEastAsia"/>
+        </w:rPr>
+        <w:t>¿Por qué es necesario filtrar contornos pequeños por área?</w:t>
+      </w:r>
+    </w:p>
+    <w:p>
+      <w:pPr>
+        <w:pStyle w:val="Ttulo6"/>
+      </w:pPr>
+      <w:r>
+        <w:rPr>
+          <w:rFonts w:eastAsiaTheme="minorEastAsia"/>
+        </w:rPr>
+        <w:t>¿Por qué no alcanza solamente con la bouding box para distinguir un círculo de un cuadrado?</w:t>
+      </w:r>
+    </w:p>
+    <w:p>
+      <w:pPr>
+        <w:pStyle w:val="Ttulo6"/>
+      </w:pPr>
+      <w:r>
+        <w:rPr>
+          <w:rFonts w:eastAsiaTheme="minorEastAsia"/>
+        </w:rPr>
+        <w:t xml:space="preserve">¿Qué </w:t>
+      </w:r>
+      <w:r>
+        <w:t>dificultades tiene esta imagen en comparación con la imagen de</w:t>
+      </w:r>
+      <w:r>
+        <w:rPr>
+          <w:rFonts w:eastAsiaTheme="minorEastAsia"/>
+        </w:rPr>
+        <w:t xml:space="preserve"> figuras geométricas trabajada en clase?</w:t>
+      </w:r>
+    </w:p>
+    <w:p>
+      <w:pPr>
+        <w:pStyle w:val="Ttulo6"/>
+      </w:pPr>
+      <w:r>
+        <w:rPr>
+          <w:rFonts w:eastAsiaTheme="minorEastAsia"/>
+        </w:rPr>
+        <w:t>¿Qué se podría mejorar si en la imagen hubiera mucho ruido o iluminación no uniforme?</w:t>
       </w:r>
     </w:p>
     <w:p>
@@ -240,6 +915,7 @@
       </w:pPr>
     </w:p>
     <w:sectPr>
+      <w:headerReference w:type="default" r:id="rId11"/>
       <w:pgSz w:w="11906" w:h="16838"/>
       <w:pgMar w:top="1417" w:right="1701" w:bottom="1417" w:left="1701" w:header="708" w:footer="708" w:gutter="0"/>
       <w:cols w:space="708"/>
@@ -249,9 +925,745 @@
 </w:document>
 </file>
 
+<file path=word/endnotes.xml><?xml version="1.0" encoding="utf-8"?>
+<w:endnotes xmlns:wpc="http://schemas.microsoft.com/office/word/2010/wordprocessingCanvas" xmlns:cx="http://schemas.microsoft.com/office/drawing/2014/chartex" xmlns:cx1="http://schemas.microsoft.com/office/drawing/2015/9/8/chartex" xmlns:cx2="http://schemas.microsoft.com/office/drawing/2015/10/21/chartex" xmlns:cx3="http://schemas.microsoft.com/office/drawing/2016/5/9/chartex" xmlns:cx4="http://schemas.microsoft.com/office/drawing/2016/5/10/chartex" xmlns:cx5="http://schemas.microsoft.com/office/drawing/2016/5/11/chartex" xmlns:cx6="http://schemas.microsoft.com/office/drawing/2016/5/12/chartex" xmlns:cx7="http://schemas.microsoft.com/office/drawing/2016/5/13/chartex" xmlns:cx8="http://schemas.microsoft.com/office/drawing/2016/5/14/chartex" xmlns:mc="http://schemas.openxmlformats.org/markup-compatibility/2006" xmlns:aink="http://schemas.microsoft.com/office/drawing/2016/ink" xmlns:am3d="http://schemas.microsoft.com/office/drawing/2017/model3d" xmlns:o="urn:schemas-microsoft-com:office:office" xmlns:oel="http://schemas.microsoft.com/office/2019/extlst" xmlns:r="http://schemas.openxmlformats.org/officeDocument/2006/relationships" xmlns:m="http://schemas.openxmlformats.org/officeDocument/2006/math" xmlns:v="urn:schemas-microsoft-com:vml" xmlns:wp14="http://schemas.microsoft.com/office/word/2010/wordprocessingDrawing" xmlns:wp="http://schemas.openxmlformats.org/drawingml/2006/wordprocessingDrawing" xmlns:w10="urn:schemas-microsoft-com:office:word" xmlns:w="http://schemas.openxmlformats.org/wordprocessingml/2006/main" xmlns:w14="http://schemas.microsoft.com/office/word/2010/wordml" xmlns:w15="http://schemas.microsoft.com/office/word/2012/wordml" xmlns:w16cex="http://schemas.microsoft.com/office/word/2018/wordml/cex" xmlns:w16cid="http://schemas.microsoft.com/office/word/2016/wordml/cid" xmlns:w16="http://schemas.microsoft.com/office/word/2018/wordml" xmlns:w16du="http://schemas.microsoft.com/office/word/2023/wordml/word16du" xmlns:w16sdtdh="http://schemas.microsoft.com/office/word/2020/wordml/sdtdatahash" xmlns:w16sdtfl="http://schemas.microsoft.com/office/word/2024/wordml/sdtformatlock" xmlns:w16se="http://schemas.microsoft.com/office/word/2015/wordml/symex" xmlns:wpg="http://schemas.microsoft.com/office/word/2010/wordprocessingGroup" xmlns:wpi="http://schemas.microsoft.com/office/word/2010/wordprocessingInk" xmlns:wne="http://schemas.microsoft.com/office/word/2006/wordml" xmlns:wps="http://schemas.microsoft.com/office/word/2010/wordprocessingShape" mc:Ignorable="w14 w15 w16se w16cid w16 w16cex w16sdtdh w16sdtfl w16du wp14">
+  <w:endnote w:type="separator" w:id="-1">
+    <w:p>
+      <w:pPr>
+        <w:spacing w:after="0" w:line="240" w:lineRule="auto"/>
+      </w:pPr>
+      <w:r>
+        <w:separator/>
+      </w:r>
+    </w:p>
+  </w:endnote>
+  <w:endnote w:type="continuationSeparator" w:id="0">
+    <w:p>
+      <w:pPr>
+        <w:spacing w:after="0" w:line="240" w:lineRule="auto"/>
+      </w:pPr>
+      <w:r>
+        <w:continuationSeparator/>
+      </w:r>
+    </w:p>
+  </w:endnote>
+</w:endnotes>
+</file>
+
+<file path=word/footnotes.xml><?xml version="1.0" encoding="utf-8"?>
+<w:footnotes xmlns:wpc="http://schemas.microsoft.com/office/word/2010/wordprocessingCanvas" xmlns:cx="http://schemas.microsoft.com/office/drawing/2014/chartex" xmlns:cx1="http://schemas.microsoft.com/office/drawing/2015/9/8/chartex" xmlns:cx2="http://schemas.microsoft.com/office/drawing/2015/10/21/chartex" xmlns:cx3="http://schemas.microsoft.com/office/drawing/2016/5/9/chartex" xmlns:cx4="http://schemas.microsoft.com/office/drawing/2016/5/10/chartex" xmlns:cx5="http://schemas.microsoft.com/office/drawing/2016/5/11/chartex" xmlns:cx6="http://schemas.microsoft.com/office/drawing/2016/5/12/chartex" xmlns:cx7="http://schemas.microsoft.com/office/drawing/2016/5/13/chartex" xmlns:cx8="http://schemas.microsoft.com/office/drawing/2016/5/14/chartex" xmlns:mc="http://schemas.openxmlformats.org/markup-compatibility/2006" xmlns:aink="http://schemas.microsoft.com/office/drawing/2016/ink" xmlns:am3d="http://schemas.microsoft.com/office/drawing/2017/model3d" xmlns:o="urn:schemas-microsoft-com:office:office" xmlns:oel="http://schemas.microsoft.com/office/2019/extlst" xmlns:r="http://schemas.openxmlformats.org/officeDocument/2006/relationships" xmlns:m="http://schemas.openxmlformats.org/officeDocument/2006/math" xmlns:v="urn:schemas-microsoft-com:vml" xmlns:wp14="http://schemas.microsoft.com/office/word/2010/wordprocessingDrawing" xmlns:wp="http://schemas.openxmlformats.org/drawingml/2006/wordprocessingDrawing" xmlns:w10="urn:schemas-microsoft-com:office:word" xmlns:w="http://schemas.openxmlformats.org/wordprocessingml/2006/main" xmlns:w14="http://schemas.microsoft.com/office/word/2010/wordml" xmlns:w15="http://schemas.microsoft.com/office/word/2012/wordml" xmlns:w16cex="http://schemas.microsoft.com/office/word/2018/wordml/cex" xmlns:w16cid="http://schemas.microsoft.com/office/word/2016/wordml/cid" xmlns:w16="http://schemas.microsoft.com/office/word/2018/wordml" xmlns:w16du="http://schemas.microsoft.com/office/word/2023/wordml/word16du" xmlns:w16sdtdh="http://schemas.microsoft.com/office/word/2020/wordml/sdtdatahash" xmlns:w16sdtfl="http://schemas.microsoft.com/office/word/2024/wordml/sdtformatlock" xmlns:w16se="http://schemas.microsoft.com/office/word/2015/wordml/symex" xmlns:wpg="http://schemas.microsoft.com/office/word/2010/wordprocessingGroup" xmlns:wpi="http://schemas.microsoft.com/office/word/2010/wordprocessingInk" xmlns:wne="http://schemas.microsoft.com/office/word/2006/wordml" xmlns:wps="http://schemas.microsoft.com/office/word/2010/wordprocessingShape" mc:Ignorable="w14 w15 w16se w16cid w16 w16cex w16sdtdh w16sdtfl w16du wp14">
+  <w:footnote w:type="separator" w:id="-1">
+    <w:p>
+      <w:pPr>
+        <w:spacing w:after="0" w:line="240" w:lineRule="auto"/>
+      </w:pPr>
+      <w:r>
+        <w:separator/>
+      </w:r>
+    </w:p>
+  </w:footnote>
+  <w:footnote w:type="continuationSeparator" w:id="0">
+    <w:p>
+      <w:pPr>
+        <w:spacing w:after="0" w:line="240" w:lineRule="auto"/>
+      </w:pPr>
+      <w:r>
+        <w:continuationSeparator/>
+      </w:r>
+    </w:p>
+  </w:footnote>
+</w:footnotes>
+</file>
+
+<file path=word/header1.xml><?xml version="1.0" encoding="utf-8"?>
+<w:hdr xmlns:wpc="http://schemas.microsoft.com/office/word/2010/wordprocessingCanvas" xmlns:cx="http://schemas.microsoft.com/office/drawing/2014/chartex" xmlns:cx1="http://schemas.microsoft.com/office/drawing/2015/9/8/chartex" xmlns:cx2="http://schemas.microsoft.com/office/drawing/2015/10/21/chartex" xmlns:cx3="http://schemas.microsoft.com/office/drawing/2016/5/9/chartex" xmlns:cx4="http://schemas.microsoft.com/office/drawing/2016/5/10/chartex" xmlns:cx5="http://schemas.microsoft.com/office/drawing/2016/5/11/chartex" xmlns:cx6="http://schemas.microsoft.com/office/drawing/2016/5/12/chartex" xmlns:cx7="http://schemas.microsoft.com/office/drawing/2016/5/13/chartex" xmlns:cx8="http://schemas.microsoft.com/office/drawing/2016/5/14/chartex" xmlns:mc="http://schemas.openxmlformats.org/markup-compatibility/2006" xmlns:aink="http://schemas.microsoft.com/office/drawing/2016/ink" xmlns:am3d="http://schemas.microsoft.com/office/drawing/2017/model3d" xmlns:o="urn:schemas-microsoft-com:office:office" xmlns:oel="http://schemas.microsoft.com/office/2019/extlst" xmlns:r="http://schemas.openxmlformats.org/officeDocument/2006/relationships" xmlns:m="http://schemas.openxmlformats.org/officeDocument/2006/math" xmlns:v="urn:schemas-microsoft-com:vml" xmlns:wp14="http://schemas.microsoft.com/office/word/2010/wordprocessingDrawing" xmlns:wp="http://schemas.openxmlformats.org/drawingml/2006/wordprocessingDrawing" xmlns:w10="urn:schemas-microsoft-com:office:word" xmlns:w="http://schemas.openxmlformats.org/wordprocessingml/2006/main" xmlns:w14="http://schemas.microsoft.com/office/word/2010/wordml" xmlns:w15="http://schemas.microsoft.com/office/word/2012/wordml" xmlns:w16cex="http://schemas.microsoft.com/office/word/2018/wordml/cex" xmlns:w16cid="http://schemas.microsoft.com/office/word/2016/wordml/cid" xmlns:w16="http://schemas.microsoft.com/office/word/2018/wordml" xmlns:w16du="http://schemas.microsoft.com/office/word/2023/wordml/word16du" xmlns:w16sdtdh="http://schemas.microsoft.com/office/word/2020/wordml/sdtdatahash" xmlns:w16sdtfl="http://schemas.microsoft.com/office/word/2024/wordml/sdtformatlock" xmlns:w16se="http://schemas.microsoft.com/office/word/2015/wordml/symex" xmlns:wpg="http://schemas.microsoft.com/office/word/2010/wordprocessingGroup" xmlns:wpi="http://schemas.microsoft.com/office/word/2010/wordprocessingInk" xmlns:wne="http://schemas.microsoft.com/office/word/2006/wordml" xmlns:wps="http://schemas.microsoft.com/office/word/2010/wordprocessingShape" mc:Ignorable="w14 w15 w16se w16cid w16 w16cex w16sdtdh w16sdtfl w16du wp14">
+  <w:p>
+    <w:pPr>
+      <w:pStyle w:val="Encabezado"/>
+    </w:pPr>
+  </w:p>
+  <w:p>
+    <w:pPr>
+      <w:pStyle w:val="Encabezado"/>
+    </w:pPr>
+  </w:p>
+  <w:p>
+    <w:pPr>
+      <w:pStyle w:val="Encabezado"/>
+    </w:pPr>
+    <w:r>
+      <w:drawing>
+        <wp:anchor distT="0" distB="0" distL="114300" distR="114300" simplePos="0" relativeHeight="251658240" behindDoc="0" locked="0" layoutInCell="1" allowOverlap="1" wp14:anchorId="50461B4D" wp14:editId="0BE52EC7">
+          <wp:simplePos x="0" y="0"/>
+          <wp:positionH relativeFrom="column">
+            <wp:posOffset>1905</wp:posOffset>
+          </wp:positionH>
+          <wp:positionV relativeFrom="page">
+            <wp:posOffset>449580</wp:posOffset>
+          </wp:positionV>
+          <wp:extent cx="2514600" cy="1009650"/>
+          <wp:effectExtent l="0" t="0" r="0" b="0"/>
+          <wp:wrapSquare wrapText="bothSides"/>
+          <wp:docPr id="2063545058" name="Imagen 1"/>
+          <wp:cNvGraphicFramePr>
+            <a:graphicFrameLocks xmlns:a="http://schemas.openxmlformats.org/drawingml/2006/main" noChangeAspect="1"/>
+          </wp:cNvGraphicFramePr>
+          <a:graphic xmlns:a="http://schemas.openxmlformats.org/drawingml/2006/main">
+            <a:graphicData uri="http://schemas.openxmlformats.org/drawingml/2006/picture">
+              <pic:pic xmlns:pic="http://schemas.openxmlformats.org/drawingml/2006/picture">
+                <pic:nvPicPr>
+                  <pic:cNvPr id="2063545058" name=""/>
+                  <pic:cNvPicPr/>
+                </pic:nvPicPr>
+                <pic:blipFill>
+                  <a:blip r:embed="rId1">
+                    <a:extLst>
+                      <a:ext uri="{28A0092B-C50C-407E-A947-70E740481C1C}">
+                        <a14:useLocalDpi xmlns:a14="http://schemas.microsoft.com/office/drawing/2010/main" val="0"/>
+                      </a:ext>
+                    </a:extLst>
+                  </a:blip>
+                  <a:stretch>
+                    <a:fillRect/>
+                  </a:stretch>
+                </pic:blipFill>
+                <pic:spPr>
+                  <a:xfrm>
+                    <a:off x="0" y="0"/>
+                    <a:ext cx="2514600" cy="1009650"/>
+                  </a:xfrm>
+                  <a:prstGeom prst="rect">
+                    <a:avLst/>
+                  </a:prstGeom>
+                </pic:spPr>
+              </pic:pic>
+            </a:graphicData>
+          </a:graphic>
+        </wp:anchor>
+      </w:drawing>
+    </w:r>
+    <w:r>
+      <w:ptab w:relativeTo="margin" w:alignment="center" w:leader="none"/>
+    </w:r>
+    <w:r>
+      <w:tab/>
+    </w:r>
+    <w:r>
+      <w:tab/>
+    </w:r>
+    <w:r>
+      <w:t>Introducción a</w:t>
+    </w:r>
+    <w:r>
+      <w:t xml:space="preserve"> </w:t>
+    </w:r>
+    <w:r>
+      <w:t>la visión artificial</w:t>
+    </w:r>
+  </w:p>
+  <w:p>
+    <w:pPr>
+      <w:pStyle w:val="Encabezado"/>
+    </w:pPr>
+  </w:p>
+  <w:p>
+    <w:pPr>
+      <w:pStyle w:val="Encabezado"/>
+    </w:pPr>
+  </w:p>
+  <w:p>
+    <w:pPr>
+      <w:pStyle w:val="Encabezado"/>
+    </w:pPr>
+  </w:p>
+</w:hdr>
+</file>
+
 <file path=word/numbering.xml><?xml version="1.0" encoding="utf-8"?>
 <w:numbering xmlns:wpc="http://schemas.microsoft.com/office/word/2010/wordprocessingCanvas" xmlns:cx="http://schemas.microsoft.com/office/drawing/2014/chartex" xmlns:cx1="http://schemas.microsoft.com/office/drawing/2015/9/8/chartex" xmlns:cx2="http://schemas.microsoft.com/office/drawing/2015/10/21/chartex" xmlns:cx3="http://schemas.microsoft.com/office/drawing/2016/5/9/chartex" xmlns:cx4="http://schemas.microsoft.com/office/drawing/2016/5/10/chartex" xmlns:cx5="http://schemas.microsoft.com/office/drawing/2016/5/11/chartex" xmlns:cx6="http://schemas.microsoft.com/office/drawing/2016/5/12/chartex" xmlns:cx7="http://schemas.microsoft.com/office/drawing/2016/5/13/chartex" xmlns:cx8="http://schemas.microsoft.com/office/drawing/2016/5/14/chartex" xmlns:mc="http://schemas.openxmlformats.org/markup-compatibility/2006" xmlns:aink="http://schemas.microsoft.com/office/drawing/2016/ink" xmlns:am3d="http://schemas.microsoft.com/office/drawing/2017/model3d" xmlns:o="urn:schemas-microsoft-com:office:office" xmlns:oel="http://schemas.microsoft.com/office/2019/extlst" xmlns:r="http://schemas.openxmlformats.org/officeDocument/2006/relationships" xmlns:m="http://schemas.openxmlformats.org/officeDocument/2006/math" xmlns:v="urn:schemas-microsoft-com:vml" xmlns:wp14="http://schemas.microsoft.com/office/word/2010/wordprocessingDrawing" xmlns:wp="http://schemas.openxmlformats.org/drawingml/2006/wordprocessingDrawing" xmlns:w10="urn:schemas-microsoft-com:office:word" xmlns:w="http://schemas.openxmlformats.org/wordprocessingml/2006/main" xmlns:w14="http://schemas.microsoft.com/office/word/2010/wordml" xmlns:w15="http://schemas.microsoft.com/office/word/2012/wordml" xmlns:w16cex="http://schemas.microsoft.com/office/word/2018/wordml/cex" xmlns:w16cid="http://schemas.microsoft.com/office/word/2016/wordml/cid" xmlns:w16="http://schemas.microsoft.com/office/word/2018/wordml" xmlns:w16du="http://schemas.microsoft.com/office/word/2023/wordml/word16du" xmlns:w16sdtdh="http://schemas.microsoft.com/office/word/2020/wordml/sdtdatahash" xmlns:w16sdtfl="http://schemas.microsoft.com/office/word/2024/wordml/sdtformatlock" xmlns:w16se="http://schemas.microsoft.com/office/word/2015/wordml/symex" xmlns:wpg="http://schemas.microsoft.com/office/word/2010/wordprocessingGroup" xmlns:wpi="http://schemas.microsoft.com/office/word/2010/wordprocessingInk" xmlns:wne="http://schemas.microsoft.com/office/word/2006/wordml" xmlns:wps="http://schemas.microsoft.com/office/word/2010/wordprocessingShape" mc:Ignorable="w14 w15 w16se w16cid w16 w16cex w16sdtdh w16sdtfl w16du wp14">
   <w:abstractNum w:abstractNumId="0" w15:restartNumberingAfterBreak="0">
+    <w:nsid w:val="09790C56"/>
+    <w:multiLevelType w:val="hybridMultilevel"/>
+    <w:tmpl w:val="93FCA5AA"/>
+    <w:lvl w:ilvl="0" w:tplc="104448FE">
+      <w:start w:val="4"/>
+      <w:numFmt w:val="bullet"/>
+      <w:lvlText w:val=""/>
+      <w:lvlJc w:val="left"/>
+      <w:pPr>
+        <w:ind w:left="1069" w:hanging="360"/>
+      </w:pPr>
+      <w:rPr>
+        <w:rFonts w:ascii="Symbol" w:eastAsiaTheme="minorEastAsia" w:hAnsi="Symbol" w:cstheme="minorBidi" w:hint="default"/>
+      </w:rPr>
+    </w:lvl>
+    <w:lvl w:ilvl="1" w:tplc="2C0A0003">
+      <w:start w:val="1"/>
+      <w:numFmt w:val="bullet"/>
+      <w:lvlText w:val="o"/>
+      <w:lvlJc w:val="left"/>
+      <w:pPr>
+        <w:ind w:left="1789" w:hanging="360"/>
+      </w:pPr>
+      <w:rPr>
+        <w:rFonts w:ascii="Courier New" w:hAnsi="Courier New" w:cs="Courier New" w:hint="default"/>
+      </w:rPr>
+    </w:lvl>
+    <w:lvl w:ilvl="2" w:tplc="2C0A0005" w:tentative="1">
+      <w:start w:val="1"/>
+      <w:numFmt w:val="bullet"/>
+      <w:lvlText w:val=""/>
+      <w:lvlJc w:val="left"/>
+      <w:pPr>
+        <w:ind w:left="2509" w:hanging="360"/>
+      </w:pPr>
+      <w:rPr>
+        <w:rFonts w:ascii="Wingdings" w:hAnsi="Wingdings" w:hint="default"/>
+      </w:rPr>
+    </w:lvl>
+    <w:lvl w:ilvl="3" w:tplc="2C0A0001" w:tentative="1">
+      <w:start w:val="1"/>
+      <w:numFmt w:val="bullet"/>
+      <w:lvlText w:val=""/>
+      <w:lvlJc w:val="left"/>
+      <w:pPr>
+        <w:ind w:left="3229" w:hanging="360"/>
+      </w:pPr>
+      <w:rPr>
+        <w:rFonts w:ascii="Symbol" w:hAnsi="Symbol" w:hint="default"/>
+      </w:rPr>
+    </w:lvl>
+    <w:lvl w:ilvl="4" w:tplc="2C0A0003" w:tentative="1">
+      <w:start w:val="1"/>
+      <w:numFmt w:val="bullet"/>
+      <w:lvlText w:val="o"/>
+      <w:lvlJc w:val="left"/>
+      <w:pPr>
+        <w:ind w:left="3949" w:hanging="360"/>
+      </w:pPr>
+      <w:rPr>
+        <w:rFonts w:ascii="Courier New" w:hAnsi="Courier New" w:cs="Courier New" w:hint="default"/>
+      </w:rPr>
+    </w:lvl>
+    <w:lvl w:ilvl="5" w:tplc="2C0A0005" w:tentative="1">
+      <w:start w:val="1"/>
+      <w:numFmt w:val="bullet"/>
+      <w:lvlText w:val=""/>
+      <w:lvlJc w:val="left"/>
+      <w:pPr>
+        <w:ind w:left="4669" w:hanging="360"/>
+      </w:pPr>
+      <w:rPr>
+        <w:rFonts w:ascii="Wingdings" w:hAnsi="Wingdings" w:hint="default"/>
+      </w:rPr>
+    </w:lvl>
+    <w:lvl w:ilvl="6" w:tplc="2C0A0001" w:tentative="1">
+      <w:start w:val="1"/>
+      <w:numFmt w:val="bullet"/>
+      <w:lvlText w:val=""/>
+      <w:lvlJc w:val="left"/>
+      <w:pPr>
+        <w:ind w:left="5389" w:hanging="360"/>
+      </w:pPr>
+      <w:rPr>
+        <w:rFonts w:ascii="Symbol" w:hAnsi="Symbol" w:hint="default"/>
+      </w:rPr>
+    </w:lvl>
+    <w:lvl w:ilvl="7" w:tplc="2C0A0003" w:tentative="1">
+      <w:start w:val="1"/>
+      <w:numFmt w:val="bullet"/>
+      <w:lvlText w:val="o"/>
+      <w:lvlJc w:val="left"/>
+      <w:pPr>
+        <w:ind w:left="6109" w:hanging="360"/>
+      </w:pPr>
+      <w:rPr>
+        <w:rFonts w:ascii="Courier New" w:hAnsi="Courier New" w:cs="Courier New" w:hint="default"/>
+      </w:rPr>
+    </w:lvl>
+    <w:lvl w:ilvl="8" w:tplc="2C0A0005" w:tentative="1">
+      <w:start w:val="1"/>
+      <w:numFmt w:val="bullet"/>
+      <w:lvlText w:val=""/>
+      <w:lvlJc w:val="left"/>
+      <w:pPr>
+        <w:ind w:left="6829" w:hanging="360"/>
+      </w:pPr>
+      <w:rPr>
+        <w:rFonts w:ascii="Wingdings" w:hAnsi="Wingdings" w:hint="default"/>
+      </w:rPr>
+    </w:lvl>
+  </w:abstractNum>
+  <w:abstractNum w:abstractNumId="1" w15:restartNumberingAfterBreak="0">
+    <w:nsid w:val="0C596CC7"/>
+    <w:multiLevelType w:val="hybridMultilevel"/>
+    <w:tmpl w:val="6520D570"/>
+    <w:lvl w:ilvl="0" w:tplc="8B1065A2">
+      <w:start w:val="1"/>
+      <w:numFmt w:val="decimal"/>
+      <w:lvlText w:val="%1."/>
+      <w:lvlJc w:val="left"/>
+      <w:pPr>
+        <w:ind w:left="1069" w:hanging="360"/>
+      </w:pPr>
+      <w:rPr>
+        <w:rFonts w:hint="default"/>
+      </w:rPr>
+    </w:lvl>
+    <w:lvl w:ilvl="1" w:tplc="2C0A0019" w:tentative="1">
+      <w:start w:val="1"/>
+      <w:numFmt w:val="lowerLetter"/>
+      <w:lvlText w:val="%2."/>
+      <w:lvlJc w:val="left"/>
+      <w:pPr>
+        <w:ind w:left="1789" w:hanging="360"/>
+      </w:pPr>
+    </w:lvl>
+    <w:lvl w:ilvl="2" w:tplc="2C0A001B" w:tentative="1">
+      <w:start w:val="1"/>
+      <w:numFmt w:val="lowerRoman"/>
+      <w:lvlText w:val="%3."/>
+      <w:lvlJc w:val="right"/>
+      <w:pPr>
+        <w:ind w:left="2509" w:hanging="180"/>
+      </w:pPr>
+    </w:lvl>
+    <w:lvl w:ilvl="3" w:tplc="2C0A000F" w:tentative="1">
+      <w:start w:val="1"/>
+      <w:numFmt w:val="decimal"/>
+      <w:lvlText w:val="%4."/>
+      <w:lvlJc w:val="left"/>
+      <w:pPr>
+        <w:ind w:left="3229" w:hanging="360"/>
+      </w:pPr>
+    </w:lvl>
+    <w:lvl w:ilvl="4" w:tplc="2C0A0019" w:tentative="1">
+      <w:start w:val="1"/>
+      <w:numFmt w:val="lowerLetter"/>
+      <w:lvlText w:val="%5."/>
+      <w:lvlJc w:val="left"/>
+      <w:pPr>
+        <w:ind w:left="3949" w:hanging="360"/>
+      </w:pPr>
+    </w:lvl>
+    <w:lvl w:ilvl="5" w:tplc="2C0A001B" w:tentative="1">
+      <w:start w:val="1"/>
+      <w:numFmt w:val="lowerRoman"/>
+      <w:lvlText w:val="%6."/>
+      <w:lvlJc w:val="right"/>
+      <w:pPr>
+        <w:ind w:left="4669" w:hanging="180"/>
+      </w:pPr>
+    </w:lvl>
+    <w:lvl w:ilvl="6" w:tplc="2C0A000F" w:tentative="1">
+      <w:start w:val="1"/>
+      <w:numFmt w:val="decimal"/>
+      <w:lvlText w:val="%7."/>
+      <w:lvlJc w:val="left"/>
+      <w:pPr>
+        <w:ind w:left="5389" w:hanging="360"/>
+      </w:pPr>
+    </w:lvl>
+    <w:lvl w:ilvl="7" w:tplc="2C0A0019" w:tentative="1">
+      <w:start w:val="1"/>
+      <w:numFmt w:val="lowerLetter"/>
+      <w:lvlText w:val="%8."/>
+      <w:lvlJc w:val="left"/>
+      <w:pPr>
+        <w:ind w:left="6109" w:hanging="360"/>
+      </w:pPr>
+    </w:lvl>
+    <w:lvl w:ilvl="8" w:tplc="2C0A001B" w:tentative="1">
+      <w:start w:val="1"/>
+      <w:numFmt w:val="lowerRoman"/>
+      <w:lvlText w:val="%9."/>
+      <w:lvlJc w:val="right"/>
+      <w:pPr>
+        <w:ind w:left="6829" w:hanging="180"/>
+      </w:pPr>
+    </w:lvl>
+  </w:abstractNum>
+  <w:abstractNum w:abstractNumId="2" w15:restartNumberingAfterBreak="0">
+    <w:nsid w:val="3EDB0B45"/>
+    <w:multiLevelType w:val="hybridMultilevel"/>
+    <w:tmpl w:val="36E66B78"/>
+    <w:lvl w:ilvl="0" w:tplc="FFFFFFFF">
+      <w:start w:val="1"/>
+      <w:numFmt w:val="decimal"/>
+      <w:lvlText w:val="%1."/>
+      <w:lvlJc w:val="left"/>
+      <w:pPr>
+        <w:ind w:left="1069" w:hanging="360"/>
+      </w:pPr>
+      <w:rPr>
+        <w:rFonts w:hint="default"/>
+      </w:rPr>
+    </w:lvl>
+    <w:lvl w:ilvl="1" w:tplc="FFFFFFFF" w:tentative="1">
+      <w:start w:val="1"/>
+      <w:numFmt w:val="lowerLetter"/>
+      <w:lvlText w:val="%2."/>
+      <w:lvlJc w:val="left"/>
+      <w:pPr>
+        <w:ind w:left="1789" w:hanging="360"/>
+      </w:pPr>
+    </w:lvl>
+    <w:lvl w:ilvl="2" w:tplc="FFFFFFFF" w:tentative="1">
+      <w:start w:val="1"/>
+      <w:numFmt w:val="lowerRoman"/>
+      <w:lvlText w:val="%3."/>
+      <w:lvlJc w:val="right"/>
+      <w:pPr>
+        <w:ind w:left="2509" w:hanging="180"/>
+      </w:pPr>
+    </w:lvl>
+    <w:lvl w:ilvl="3" w:tplc="FFFFFFFF" w:tentative="1">
+      <w:start w:val="1"/>
+      <w:numFmt w:val="decimal"/>
+      <w:lvlText w:val="%4."/>
+      <w:lvlJc w:val="left"/>
+      <w:pPr>
+        <w:ind w:left="3229" w:hanging="360"/>
+      </w:pPr>
+    </w:lvl>
+    <w:lvl w:ilvl="4" w:tplc="FFFFFFFF" w:tentative="1">
+      <w:start w:val="1"/>
+      <w:numFmt w:val="lowerLetter"/>
+      <w:lvlText w:val="%5."/>
+      <w:lvlJc w:val="left"/>
+      <w:pPr>
+        <w:ind w:left="3949" w:hanging="360"/>
+      </w:pPr>
+    </w:lvl>
+    <w:lvl w:ilvl="5" w:tplc="FFFFFFFF" w:tentative="1">
+      <w:start w:val="1"/>
+      <w:numFmt w:val="lowerRoman"/>
+      <w:lvlText w:val="%6."/>
+      <w:lvlJc w:val="right"/>
+      <w:pPr>
+        <w:ind w:left="4669" w:hanging="180"/>
+      </w:pPr>
+    </w:lvl>
+    <w:lvl w:ilvl="6" w:tplc="FFFFFFFF" w:tentative="1">
+      <w:start w:val="1"/>
+      <w:numFmt w:val="decimal"/>
+      <w:lvlText w:val="%7."/>
+      <w:lvlJc w:val="left"/>
+      <w:pPr>
+        <w:ind w:left="5389" w:hanging="360"/>
+      </w:pPr>
+    </w:lvl>
+    <w:lvl w:ilvl="7" w:tplc="FFFFFFFF" w:tentative="1">
+      <w:start w:val="1"/>
+      <w:numFmt w:val="lowerLetter"/>
+      <w:lvlText w:val="%8."/>
+      <w:lvlJc w:val="left"/>
+      <w:pPr>
+        <w:ind w:left="6109" w:hanging="360"/>
+      </w:pPr>
+    </w:lvl>
+    <w:lvl w:ilvl="8" w:tplc="FFFFFFFF" w:tentative="1">
+      <w:start w:val="1"/>
+      <w:numFmt w:val="lowerRoman"/>
+      <w:lvlText w:val="%9."/>
+      <w:lvlJc w:val="right"/>
+      <w:pPr>
+        <w:ind w:left="6829" w:hanging="180"/>
+      </w:pPr>
+    </w:lvl>
+  </w:abstractNum>
+  <w:abstractNum w:abstractNumId="3" w15:restartNumberingAfterBreak="0">
+    <w:nsid w:val="4A001836"/>
+    <w:multiLevelType w:val="hybridMultilevel"/>
+    <w:tmpl w:val="F230B5A6"/>
+    <w:lvl w:ilvl="0" w:tplc="ED264824">
+      <w:start w:val="1"/>
+      <w:numFmt w:val="bullet"/>
+      <w:lvlText w:val=""/>
+      <w:lvlJc w:val="left"/>
+      <w:pPr>
+        <w:ind w:left="1069" w:hanging="360"/>
+      </w:pPr>
+      <w:rPr>
+        <w:rFonts w:ascii="Symbol" w:eastAsiaTheme="minorHAnsi" w:hAnsi="Symbol" w:cstheme="minorBidi" w:hint="default"/>
+      </w:rPr>
+    </w:lvl>
+    <w:lvl w:ilvl="1" w:tplc="2C0A0003" w:tentative="1">
+      <w:start w:val="1"/>
+      <w:numFmt w:val="bullet"/>
+      <w:lvlText w:val="o"/>
+      <w:lvlJc w:val="left"/>
+      <w:pPr>
+        <w:ind w:left="1789" w:hanging="360"/>
+      </w:pPr>
+      <w:rPr>
+        <w:rFonts w:ascii="Courier New" w:hAnsi="Courier New" w:cs="Courier New" w:hint="default"/>
+      </w:rPr>
+    </w:lvl>
+    <w:lvl w:ilvl="2" w:tplc="2C0A0005" w:tentative="1">
+      <w:start w:val="1"/>
+      <w:numFmt w:val="bullet"/>
+      <w:lvlText w:val=""/>
+      <w:lvlJc w:val="left"/>
+      <w:pPr>
+        <w:ind w:left="2509" w:hanging="360"/>
+      </w:pPr>
+      <w:rPr>
+        <w:rFonts w:ascii="Wingdings" w:hAnsi="Wingdings" w:hint="default"/>
+      </w:rPr>
+    </w:lvl>
+    <w:lvl w:ilvl="3" w:tplc="2C0A0001" w:tentative="1">
+      <w:start w:val="1"/>
+      <w:numFmt w:val="bullet"/>
+      <w:lvlText w:val=""/>
+      <w:lvlJc w:val="left"/>
+      <w:pPr>
+        <w:ind w:left="3229" w:hanging="360"/>
+      </w:pPr>
+      <w:rPr>
+        <w:rFonts w:ascii="Symbol" w:hAnsi="Symbol" w:hint="default"/>
+      </w:rPr>
+    </w:lvl>
+    <w:lvl w:ilvl="4" w:tplc="2C0A0003" w:tentative="1">
+      <w:start w:val="1"/>
+      <w:numFmt w:val="bullet"/>
+      <w:lvlText w:val="o"/>
+      <w:lvlJc w:val="left"/>
+      <w:pPr>
+        <w:ind w:left="3949" w:hanging="360"/>
+      </w:pPr>
+      <w:rPr>
+        <w:rFonts w:ascii="Courier New" w:hAnsi="Courier New" w:cs="Courier New" w:hint="default"/>
+      </w:rPr>
+    </w:lvl>
+    <w:lvl w:ilvl="5" w:tplc="2C0A0005" w:tentative="1">
+      <w:start w:val="1"/>
+      <w:numFmt w:val="bullet"/>
+      <w:lvlText w:val=""/>
+      <w:lvlJc w:val="left"/>
+      <w:pPr>
+        <w:ind w:left="4669" w:hanging="360"/>
+      </w:pPr>
+      <w:rPr>
+        <w:rFonts w:ascii="Wingdings" w:hAnsi="Wingdings" w:hint="default"/>
+      </w:rPr>
+    </w:lvl>
+    <w:lvl w:ilvl="6" w:tplc="2C0A0001" w:tentative="1">
+      <w:start w:val="1"/>
+      <w:numFmt w:val="bullet"/>
+      <w:lvlText w:val=""/>
+      <w:lvlJc w:val="left"/>
+      <w:pPr>
+        <w:ind w:left="5389" w:hanging="360"/>
+      </w:pPr>
+      <w:rPr>
+        <w:rFonts w:ascii="Symbol" w:hAnsi="Symbol" w:hint="default"/>
+      </w:rPr>
+    </w:lvl>
+    <w:lvl w:ilvl="7" w:tplc="2C0A0003" w:tentative="1">
+      <w:start w:val="1"/>
+      <w:numFmt w:val="bullet"/>
+      <w:lvlText w:val="o"/>
+      <w:lvlJc w:val="left"/>
+      <w:pPr>
+        <w:ind w:left="6109" w:hanging="360"/>
+      </w:pPr>
+      <w:rPr>
+        <w:rFonts w:ascii="Courier New" w:hAnsi="Courier New" w:cs="Courier New" w:hint="default"/>
+      </w:rPr>
+    </w:lvl>
+    <w:lvl w:ilvl="8" w:tplc="2C0A0005" w:tentative="1">
+      <w:start w:val="1"/>
+      <w:numFmt w:val="bullet"/>
+      <w:lvlText w:val=""/>
+      <w:lvlJc w:val="left"/>
+      <w:pPr>
+        <w:ind w:left="6829" w:hanging="360"/>
+      </w:pPr>
+      <w:rPr>
+        <w:rFonts w:ascii="Wingdings" w:hAnsi="Wingdings" w:hint="default"/>
+      </w:rPr>
+    </w:lvl>
+  </w:abstractNum>
+  <w:abstractNum w:abstractNumId="4" w15:restartNumberingAfterBreak="0">
+    <w:nsid w:val="55D924BD"/>
+    <w:multiLevelType w:val="hybridMultilevel"/>
+    <w:tmpl w:val="90883AF6"/>
+    <w:lvl w:ilvl="0" w:tplc="3342DCCC">
+      <w:start w:val="1"/>
+      <w:numFmt w:val="decimal"/>
+      <w:lvlText w:val="%1."/>
+      <w:lvlJc w:val="left"/>
+      <w:pPr>
+        <w:ind w:left="1069" w:hanging="360"/>
+      </w:pPr>
+      <w:rPr>
+        <w:rFonts w:hint="default"/>
+      </w:rPr>
+    </w:lvl>
+    <w:lvl w:ilvl="1" w:tplc="2C0A0019" w:tentative="1">
+      <w:start w:val="1"/>
+      <w:numFmt w:val="lowerLetter"/>
+      <w:lvlText w:val="%2."/>
+      <w:lvlJc w:val="left"/>
+      <w:pPr>
+        <w:ind w:left="1789" w:hanging="360"/>
+      </w:pPr>
+    </w:lvl>
+    <w:lvl w:ilvl="2" w:tplc="2C0A001B" w:tentative="1">
+      <w:start w:val="1"/>
+      <w:numFmt w:val="lowerRoman"/>
+      <w:lvlText w:val="%3."/>
+      <w:lvlJc w:val="right"/>
+      <w:pPr>
+        <w:ind w:left="2509" w:hanging="180"/>
+      </w:pPr>
+    </w:lvl>
+    <w:lvl w:ilvl="3" w:tplc="2C0A000F" w:tentative="1">
+      <w:start w:val="1"/>
+      <w:numFmt w:val="decimal"/>
+      <w:lvlText w:val="%4."/>
+      <w:lvlJc w:val="left"/>
+      <w:pPr>
+        <w:ind w:left="3229" w:hanging="360"/>
+      </w:pPr>
+    </w:lvl>
+    <w:lvl w:ilvl="4" w:tplc="2C0A0019" w:tentative="1">
+      <w:start w:val="1"/>
+      <w:numFmt w:val="lowerLetter"/>
+      <w:lvlText w:val="%5."/>
+      <w:lvlJc w:val="left"/>
+      <w:pPr>
+        <w:ind w:left="3949" w:hanging="360"/>
+      </w:pPr>
+    </w:lvl>
+    <w:lvl w:ilvl="5" w:tplc="2C0A001B" w:tentative="1">
+      <w:start w:val="1"/>
+      <w:numFmt w:val="lowerRoman"/>
+      <w:lvlText w:val="%6."/>
+      <w:lvlJc w:val="right"/>
+      <w:pPr>
+        <w:ind w:left="4669" w:hanging="180"/>
+      </w:pPr>
+    </w:lvl>
+    <w:lvl w:ilvl="6" w:tplc="2C0A000F" w:tentative="1">
+      <w:start w:val="1"/>
+      <w:numFmt w:val="decimal"/>
+      <w:lvlText w:val="%7."/>
+      <w:lvlJc w:val="left"/>
+      <w:pPr>
+        <w:ind w:left="5389" w:hanging="360"/>
+      </w:pPr>
+    </w:lvl>
+    <w:lvl w:ilvl="7" w:tplc="2C0A0019" w:tentative="1">
+      <w:start w:val="1"/>
+      <w:numFmt w:val="lowerLetter"/>
+      <w:lvlText w:val="%8."/>
+      <w:lvlJc w:val="left"/>
+      <w:pPr>
+        <w:ind w:left="6109" w:hanging="360"/>
+      </w:pPr>
+    </w:lvl>
+    <w:lvl w:ilvl="8" w:tplc="2C0A001B" w:tentative="1">
+      <w:start w:val="1"/>
+      <w:numFmt w:val="lowerRoman"/>
+      <w:lvlText w:val="%9."/>
+      <w:lvlJc w:val="right"/>
+      <w:pPr>
+        <w:ind w:left="6829" w:hanging="180"/>
+      </w:pPr>
+    </w:lvl>
+  </w:abstractNum>
+  <w:abstractNum w:abstractNumId="5" w15:restartNumberingAfterBreak="0">
+    <w:nsid w:val="5B1460BC"/>
+    <w:multiLevelType w:val="hybridMultilevel"/>
+    <w:tmpl w:val="36E66B78"/>
+    <w:lvl w:ilvl="0" w:tplc="3342DCCC">
+      <w:start w:val="1"/>
+      <w:numFmt w:val="decimal"/>
+      <w:lvlText w:val="%1."/>
+      <w:lvlJc w:val="left"/>
+      <w:pPr>
+        <w:ind w:left="1069" w:hanging="360"/>
+      </w:pPr>
+      <w:rPr>
+        <w:rFonts w:hint="default"/>
+      </w:rPr>
+    </w:lvl>
+    <w:lvl w:ilvl="1" w:tplc="2C0A0019" w:tentative="1">
+      <w:start w:val="1"/>
+      <w:numFmt w:val="lowerLetter"/>
+      <w:lvlText w:val="%2."/>
+      <w:lvlJc w:val="left"/>
+      <w:pPr>
+        <w:ind w:left="1789" w:hanging="360"/>
+      </w:pPr>
+    </w:lvl>
+    <w:lvl w:ilvl="2" w:tplc="2C0A001B" w:tentative="1">
+      <w:start w:val="1"/>
+      <w:numFmt w:val="lowerRoman"/>
+      <w:lvlText w:val="%3."/>
+      <w:lvlJc w:val="right"/>
+      <w:pPr>
+        <w:ind w:left="2509" w:hanging="180"/>
+      </w:pPr>
+    </w:lvl>
+    <w:lvl w:ilvl="3" w:tplc="2C0A000F" w:tentative="1">
+      <w:start w:val="1"/>
+      <w:numFmt w:val="decimal"/>
+      <w:lvlText w:val="%4."/>
+      <w:lvlJc w:val="left"/>
+      <w:pPr>
+        <w:ind w:left="3229" w:hanging="360"/>
+      </w:pPr>
+    </w:lvl>
+    <w:lvl w:ilvl="4" w:tplc="2C0A0019" w:tentative="1">
+      <w:start w:val="1"/>
+      <w:numFmt w:val="lowerLetter"/>
+      <w:lvlText w:val="%5."/>
+      <w:lvlJc w:val="left"/>
+      <w:pPr>
+        <w:ind w:left="3949" w:hanging="360"/>
+      </w:pPr>
+    </w:lvl>
+    <w:lvl w:ilvl="5" w:tplc="2C0A001B" w:tentative="1">
+      <w:start w:val="1"/>
+      <w:numFmt w:val="lowerRoman"/>
+      <w:lvlText w:val="%6."/>
+      <w:lvlJc w:val="right"/>
+      <w:pPr>
+        <w:ind w:left="4669" w:hanging="180"/>
+      </w:pPr>
+    </w:lvl>
+    <w:lvl w:ilvl="6" w:tplc="2C0A000F" w:tentative="1">
+      <w:start w:val="1"/>
+      <w:numFmt w:val="decimal"/>
+      <w:lvlText w:val="%7."/>
+      <w:lvlJc w:val="left"/>
+      <w:pPr>
+        <w:ind w:left="5389" w:hanging="360"/>
+      </w:pPr>
+    </w:lvl>
+    <w:lvl w:ilvl="7" w:tplc="2C0A0019" w:tentative="1">
+      <w:start w:val="1"/>
+      <w:numFmt w:val="lowerLetter"/>
+      <w:lvlText w:val="%8."/>
+      <w:lvlJc w:val="left"/>
+      <w:pPr>
+        <w:ind w:left="6109" w:hanging="360"/>
+      </w:pPr>
+    </w:lvl>
+    <w:lvl w:ilvl="8" w:tplc="2C0A001B" w:tentative="1">
+      <w:start w:val="1"/>
+      <w:numFmt w:val="lowerRoman"/>
+      <w:lvlText w:val="%9."/>
+      <w:lvlJc w:val="right"/>
+      <w:pPr>
+        <w:ind w:left="6829" w:hanging="180"/>
+      </w:pPr>
+    </w:lvl>
+  </w:abstractNum>
+  <w:abstractNum w:abstractNumId="6" w15:restartNumberingAfterBreak="0">
     <w:nsid w:val="5CB72F79"/>
     <w:multiLevelType w:val="hybridMultilevel"/>
     <w:tmpl w:val="9CD29ADC"/>
@@ -341,7 +1753,25 @@
     </w:lvl>
   </w:abstractNum>
   <w:num w:numId="1" w16cid:durableId="1867449385">
+    <w:abstractNumId w:val="6"/>
+  </w:num>
+  <w:num w:numId="2" w16cid:durableId="1497066756">
     <w:abstractNumId w:val="0"/>
+  </w:num>
+  <w:num w:numId="3" w16cid:durableId="1466778255">
+    <w:abstractNumId w:val="5"/>
+  </w:num>
+  <w:num w:numId="4" w16cid:durableId="158270909">
+    <w:abstractNumId w:val="1"/>
+  </w:num>
+  <w:num w:numId="5" w16cid:durableId="1773359876">
+    <w:abstractNumId w:val="3"/>
+  </w:num>
+  <w:num w:numId="6" w16cid:durableId="326448411">
+    <w:abstractNumId w:val="2"/>
+  </w:num>
+  <w:num w:numId="7" w16cid:durableId="1599026617">
+    <w:abstractNumId w:val="4"/>
   </w:num>
 </w:numbering>
 </file>
@@ -775,7 +2205,6 @@
     <w:next w:val="Normal"/>
     <w:link w:val="Ttulo2Car"/>
     <w:uiPriority w:val="9"/>
-    <w:semiHidden/>
     <w:unhideWhenUsed/>
     <w:qFormat/>
     <w:rsid w:val="00523477"/>
@@ -798,7 +2227,6 @@
     <w:next w:val="Normal"/>
     <w:link w:val="Ttulo3Car"/>
     <w:uiPriority w:val="9"/>
-    <w:semiHidden/>
     <w:unhideWhenUsed/>
     <w:qFormat/>
     <w:rsid w:val="00523477"/>
@@ -821,7 +2249,6 @@
     <w:next w:val="Normal"/>
     <w:link w:val="Ttulo4Car"/>
     <w:uiPriority w:val="9"/>
-    <w:semiHidden/>
     <w:unhideWhenUsed/>
     <w:qFormat/>
     <w:rsid w:val="00523477"/>
@@ -844,7 +2271,6 @@
     <w:next w:val="Normal"/>
     <w:link w:val="Ttulo5Car"/>
     <w:uiPriority w:val="9"/>
-    <w:semiHidden/>
     <w:unhideWhenUsed/>
     <w:qFormat/>
     <w:rsid w:val="00523477"/>
@@ -865,7 +2291,6 @@
     <w:next w:val="Normal"/>
     <w:link w:val="Ttulo6Car"/>
     <w:uiPriority w:val="9"/>
-    <w:semiHidden/>
     <w:unhideWhenUsed/>
     <w:qFormat/>
     <w:rsid w:val="00523477"/>
@@ -950,7 +2375,6 @@
   <w:style w:type="character" w:default="1" w:styleId="Fuentedeprrafopredeter">
     <w:name w:val="Default Paragraph Font"/>
     <w:uiPriority w:val="1"/>
-    <w:semiHidden/>
     <w:unhideWhenUsed/>
   </w:style>
   <w:style w:type="table" w:default="1" w:styleId="Tablanormal">
@@ -992,7 +2416,6 @@
     <w:basedOn w:val="Fuentedeprrafopredeter"/>
     <w:link w:val="Ttulo2"/>
     <w:uiPriority w:val="9"/>
-    <w:semiHidden/>
     <w:rsid w:val="00523477"/>
     <w:rPr>
       <w:rFonts w:asciiTheme="majorHAnsi" w:eastAsiaTheme="majorEastAsia" w:hAnsiTheme="majorHAnsi" w:cstheme="majorBidi"/>
@@ -1006,7 +2429,6 @@
     <w:basedOn w:val="Fuentedeprrafopredeter"/>
     <w:link w:val="Ttulo3"/>
     <w:uiPriority w:val="9"/>
-    <w:semiHidden/>
     <w:rsid w:val="00523477"/>
     <w:rPr>
       <w:rFonts w:eastAsiaTheme="majorEastAsia" w:cstheme="majorBidi"/>
@@ -1020,7 +2442,6 @@
     <w:basedOn w:val="Fuentedeprrafopredeter"/>
     <w:link w:val="Ttulo4"/>
     <w:uiPriority w:val="9"/>
-    <w:semiHidden/>
     <w:rsid w:val="00523477"/>
     <w:rPr>
       <w:rFonts w:eastAsiaTheme="majorEastAsia" w:cstheme="majorBidi"/>
@@ -1034,7 +2455,6 @@
     <w:basedOn w:val="Fuentedeprrafopredeter"/>
     <w:link w:val="Ttulo5"/>
     <w:uiPriority w:val="9"/>
-    <w:semiHidden/>
     <w:rsid w:val="00523477"/>
     <w:rPr>
       <w:rFonts w:eastAsiaTheme="majorEastAsia" w:cstheme="majorBidi"/>
@@ -1046,7 +2466,6 @@
     <w:basedOn w:val="Fuentedeprrafopredeter"/>
     <w:link w:val="Ttulo6"/>
     <w:uiPriority w:val="9"/>
-    <w:semiHidden/>
     <w:rsid w:val="00523477"/>
     <w:rPr>
       <w:rFonts w:eastAsiaTheme="majorEastAsia" w:cstheme="majorBidi"/>
@@ -1278,6 +2697,60 @@
     <w:rPr>
       <w:rFonts w:ascii="Arial" w:hAnsi="Arial"/>
     </w:rPr>
+  </w:style>
+  <w:style w:type="character" w:styleId="Textodelmarcadordeposicin">
+    <w:name w:val="Placeholder Text"/>
+    <w:basedOn w:val="Fuentedeprrafopredeter"/>
+    <w:uiPriority w:val="99"/>
+    <w:semiHidden/>
+    <w:rsid w:val="004E4817"/>
+    <w:rPr>
+      <w:color w:val="666666"/>
+    </w:rPr>
+  </w:style>
+  <w:style w:type="paragraph" w:styleId="Encabezado">
+    <w:name w:val="header"/>
+    <w:basedOn w:val="Normal"/>
+    <w:link w:val="EncabezadoCar"/>
+    <w:uiPriority w:val="99"/>
+    <w:unhideWhenUsed/>
+    <w:rsid w:val="000B3BA8"/>
+    <w:pPr>
+      <w:tabs>
+        <w:tab w:val="center" w:pos="4252"/>
+        <w:tab w:val="right" w:pos="8504"/>
+      </w:tabs>
+      <w:spacing w:after="0" w:line="240" w:lineRule="auto"/>
+    </w:pPr>
+  </w:style>
+  <w:style w:type="character" w:customStyle="1" w:styleId="EncabezadoCar">
+    <w:name w:val="Encabezado Car"/>
+    <w:basedOn w:val="Fuentedeprrafopredeter"/>
+    <w:link w:val="Encabezado"/>
+    <w:uiPriority w:val="99"/>
+    <w:rsid w:val="000B3BA8"/>
+  </w:style>
+  <w:style w:type="paragraph" w:styleId="Piedepgina">
+    <w:name w:val="footer"/>
+    <w:basedOn w:val="Normal"/>
+    <w:link w:val="PiedepginaCar"/>
+    <w:uiPriority w:val="99"/>
+    <w:unhideWhenUsed/>
+    <w:rsid w:val="000B3BA8"/>
+    <w:pPr>
+      <w:tabs>
+        <w:tab w:val="center" w:pos="4252"/>
+        <w:tab w:val="right" w:pos="8504"/>
+      </w:tabs>
+      <w:spacing w:after="0" w:line="240" w:lineRule="auto"/>
+    </w:pPr>
+  </w:style>
+  <w:style w:type="character" w:customStyle="1" w:styleId="PiedepginaCar">
+    <w:name w:val="Pie de página Car"/>
+    <w:basedOn w:val="Fuentedeprrafopredeter"/>
+    <w:link w:val="Piedepgina"/>
+    <w:uiPriority w:val="99"/>
+    <w:rsid w:val="000B3BA8"/>
   </w:style>
 </w:styles>
 </file>

</xml_diff>